<commit_message>
el nivel difícil evalúa posición y no pasea al rey
</commit_message>
<xml_diff>
--- a/docs/justificacion.docx
+++ b/docs/justificacion.docx
@@ -1837,7 +1837,25 @@
           <w:color w:val="000000"/>
           <w:sz w:val="24"/>
         </w:rPr>
-        <w:t xml:space="preserve"> con tres niveles (azar, captura codiciosa y minimax de profundidad 2). Piensa sobre una partida de búsqueda propia y juega su jugada por </w:t>
+        <w:t xml:space="preserve"> con tres niveles (azar, captura codiciosa y minimax de profundidad 2). El minimax evalúa con el material y un poco de criterio posicional (</w:t>
+      </w:r>
+      <w:r>
+        <w:rPr>
+          <w:rFonts w:ascii="Courier New" w:hAnsi="Courier New" w:eastAsia="Courier New"/>
+          <w:b w:val="0"/>
+          <w:color w:val="000000"/>
+          <w:sz w:val="20"/>
+        </w:rPr>
+        <w:t>Evaluation</w:t>
+      </w:r>
+      <w:r>
+        <w:rPr>
+          <w:rFonts w:ascii="Times New Roman" w:hAnsi="Times New Roman" w:eastAsia="Times New Roman"/>
+          <w:b w:val="0"/>
+          <w:color w:val="000000"/>
+          <w:sz w:val="24"/>
+        </w:rPr>
+        <w:t xml:space="preserve">: peones y piezas hacia el centro, desarrollo de caballos y alfiles, y el rey en su fila mientras haya damas), para que no juegue al azar cuando ninguna jugada gana material. Piensa sobre una partida de búsqueda propia y juega su jugada por </w:t>
       </w:r>
       <w:r>
         <w:rPr>

</xml_diff>

<commit_message>
Login con usuario e id y ranking de partidas
Los usuarios se registran o entran por consola y por ventana, sin contraseña. Al terminar una partida se suman los puntos (3 por victoria, 1 por empate), se revierten si se deshace la jugada final y quedan guardados en data/usuarios.csv. Se agrega docs/cambios-usuarios-y-ranking.md con la explicación técnica.
</commit_message>
<xml_diff>
--- a/docs/justificacion.docx
+++ b/docs/justificacion.docx
@@ -1927,6 +1927,278 @@
           <w:color w:val="000000"/>
           <w:sz w:val="28"/>
         </w:rPr>
+        <w:t>11 bis. Usuarios y ranking también viven afuera del núcleo</w:t>
+      </w:r>
+    </w:p>
+    <w:p>
+      <w:r>
+        <w:rPr>
+          <w:rFonts w:ascii="Times New Roman" w:hAnsi="Times New Roman" w:eastAsia="Times New Roman"/>
+          <w:b/>
+          <w:color w:val="000000"/>
+          <w:sz w:val="24"/>
+        </w:rPr>
+        <w:t>Qué.</w:t>
+      </w:r>
+      <w:r>
+        <w:rPr>
+          <w:rFonts w:ascii="Times New Roman" w:hAnsi="Times New Roman" w:eastAsia="Times New Roman"/>
+          <w:b w:val="0"/>
+          <w:color w:val="000000"/>
+          <w:sz w:val="24"/>
+        </w:rPr>
+        <w:t xml:space="preserve"> El paquete </w:t>
+      </w:r>
+      <w:r>
+        <w:rPr>
+          <w:rFonts w:ascii="Courier New" w:hAnsi="Courier New" w:eastAsia="Courier New"/>
+          <w:b w:val="0"/>
+          <w:color w:val="000000"/>
+          <w:sz w:val="20"/>
+        </w:rPr>
+        <w:t>usuarios</w:t>
+      </w:r>
+      <w:r>
+        <w:rPr>
+          <w:rFonts w:ascii="Times New Roman" w:hAnsi="Times New Roman" w:eastAsia="Times New Roman"/>
+          <w:b w:val="0"/>
+          <w:color w:val="000000"/>
+          <w:sz w:val="24"/>
+        </w:rPr>
+        <w:t xml:space="preserve"> tiene </w:t>
+      </w:r>
+      <w:r>
+        <w:rPr>
+          <w:rFonts w:ascii="Courier New" w:hAnsi="Courier New" w:eastAsia="Courier New"/>
+          <w:b w:val="0"/>
+          <w:color w:val="000000"/>
+          <w:sz w:val="20"/>
+        </w:rPr>
+        <w:t>User</w:t>
+      </w:r>
+      <w:r>
+        <w:rPr>
+          <w:rFonts w:ascii="Times New Roman" w:hAnsi="Times New Roman" w:eastAsia="Times New Roman"/>
+          <w:b w:val="0"/>
+          <w:color w:val="000000"/>
+          <w:sz w:val="24"/>
+        </w:rPr>
+        <w:t xml:space="preserve"> y </w:t>
+      </w:r>
+      <w:r>
+        <w:rPr>
+          <w:rFonts w:ascii="Courier New" w:hAnsi="Courier New" w:eastAsia="Courier New"/>
+          <w:b w:val="0"/>
+          <w:color w:val="000000"/>
+          <w:sz w:val="20"/>
+        </w:rPr>
+        <w:t>Score</w:t>
+      </w:r>
+      <w:r>
+        <w:rPr>
+          <w:rFonts w:ascii="Times New Roman" w:hAnsi="Times New Roman" w:eastAsia="Times New Roman"/>
+          <w:b w:val="0"/>
+          <w:color w:val="000000"/>
+          <w:sz w:val="24"/>
+        </w:rPr>
+        <w:t xml:space="preserve"> (valores inmutables), </w:t>
+      </w:r>
+      <w:r>
+        <w:rPr>
+          <w:rFonts w:ascii="Courier New" w:hAnsi="Courier New" w:eastAsia="Courier New"/>
+          <w:b w:val="0"/>
+          <w:color w:val="000000"/>
+          <w:sz w:val="20"/>
+        </w:rPr>
+        <w:t>AccountService</w:t>
+      </w:r>
+      <w:r>
+        <w:rPr>
+          <w:rFonts w:ascii="Times New Roman" w:hAnsi="Times New Roman" w:eastAsia="Times New Roman"/>
+          <w:b w:val="0"/>
+          <w:color w:val="000000"/>
+          <w:sz w:val="24"/>
+        </w:rPr>
+        <w:t xml:space="preserve"> (registrar, entrar, armar el ranking) y </w:t>
+      </w:r>
+      <w:r>
+        <w:rPr>
+          <w:rFonts w:ascii="Courier New" w:hAnsi="Courier New" w:eastAsia="Courier New"/>
+          <w:b w:val="0"/>
+          <w:color w:val="000000"/>
+          <w:sz w:val="20"/>
+        </w:rPr>
+        <w:t>ScoreRecorder</w:t>
+      </w:r>
+      <w:r>
+        <w:rPr>
+          <w:rFonts w:ascii="Times New Roman" w:hAnsi="Times New Roman" w:eastAsia="Times New Roman"/>
+          <w:b w:val="0"/>
+          <w:color w:val="000000"/>
+          <w:sz w:val="24"/>
+        </w:rPr>
+        <w:t>, un observador que escucha la partida y acredita el resultado. Guardar los datos es un puerto de salida (</w:t>
+      </w:r>
+      <w:r>
+        <w:rPr>
+          <w:rFonts w:ascii="Courier New" w:hAnsi="Courier New" w:eastAsia="Courier New"/>
+          <w:b w:val="0"/>
+          <w:color w:val="000000"/>
+          <w:sz w:val="20"/>
+        </w:rPr>
+        <w:t>IAccountStore</w:t>
+      </w:r>
+      <w:r>
+        <w:rPr>
+          <w:rFonts w:ascii="Times New Roman" w:hAnsi="Times New Roman" w:eastAsia="Times New Roman"/>
+          <w:b w:val="0"/>
+          <w:color w:val="000000"/>
+          <w:sz w:val="24"/>
+        </w:rPr>
+        <w:t>) con un adaptador de archivo CSV (</w:t>
+      </w:r>
+      <w:r>
+        <w:rPr>
+          <w:rFonts w:ascii="Courier New" w:hAnsi="Courier New" w:eastAsia="Courier New"/>
+          <w:b w:val="0"/>
+          <w:color w:val="000000"/>
+          <w:sz w:val="20"/>
+        </w:rPr>
+        <w:t>FileAccountStore</w:t>
+      </w:r>
+      <w:r>
+        <w:rPr>
+          <w:rFonts w:ascii="Times New Roman" w:hAnsi="Times New Roman" w:eastAsia="Times New Roman"/>
+          <w:b w:val="0"/>
+          <w:color w:val="000000"/>
+          <w:sz w:val="24"/>
+        </w:rPr>
+        <w:t>). Entrar es por usuario e id, sin contraseña.</w:t>
+      </w:r>
+    </w:p>
+    <w:p>
+      <w:r>
+        <w:rPr>
+          <w:rFonts w:ascii="Times New Roman" w:hAnsi="Times New Roman" w:eastAsia="Times New Roman"/>
+          <w:b/>
+          <w:color w:val="000000"/>
+          <w:sz w:val="24"/>
+        </w:rPr>
+        <w:t>Por qué.</w:t>
+      </w:r>
+      <w:r>
+        <w:rPr>
+          <w:rFonts w:ascii="Times New Roman" w:hAnsi="Times New Roman" w:eastAsia="Times New Roman"/>
+          <w:b w:val="0"/>
+          <w:color w:val="000000"/>
+          <w:sz w:val="24"/>
+        </w:rPr>
+        <w:t xml:space="preserve"> Quién juega y cuántas partidas ganó no es una regla del ajedrez. Como </w:t>
+      </w:r>
+      <w:r>
+        <w:rPr>
+          <w:rFonts w:ascii="Courier New" w:hAnsi="Courier New" w:eastAsia="Courier New"/>
+          <w:b w:val="0"/>
+          <w:color w:val="000000"/>
+          <w:sz w:val="20"/>
+        </w:rPr>
+        <w:t>ScoreRecorder</w:t>
+      </w:r>
+      <w:r>
+        <w:rPr>
+          <w:rFonts w:ascii="Times New Roman" w:hAnsi="Times New Roman" w:eastAsia="Times New Roman"/>
+          <w:b w:val="0"/>
+          <w:color w:val="000000"/>
+          <w:sz w:val="24"/>
+        </w:rPr>
+        <w:t xml:space="preserve"> implementa los mismos </w:t>
+      </w:r>
+      <w:r>
+        <w:rPr>
+          <w:rFonts w:ascii="Courier New" w:hAnsi="Courier New" w:eastAsia="Courier New"/>
+          <w:b w:val="0"/>
+          <w:color w:val="000000"/>
+          <w:sz w:val="20"/>
+        </w:rPr>
+        <w:t>IMoveListener</w:t>
+      </w:r>
+      <w:r>
+        <w:rPr>
+          <w:rFonts w:ascii="Times New Roman" w:hAnsi="Times New Roman" w:eastAsia="Times New Roman"/>
+          <w:b w:val="0"/>
+          <w:color w:val="000000"/>
+          <w:sz w:val="24"/>
+        </w:rPr>
+        <w:t xml:space="preserve"> e </w:t>
+      </w:r>
+      <w:r>
+        <w:rPr>
+          <w:rFonts w:ascii="Courier New" w:hAnsi="Courier New" w:eastAsia="Courier New"/>
+          <w:b w:val="0"/>
+          <w:color w:val="000000"/>
+          <w:sz w:val="20"/>
+        </w:rPr>
+        <w:t>IGameStatusListener</w:t>
+      </w:r>
+      <w:r>
+        <w:rPr>
+          <w:rFonts w:ascii="Times New Roman" w:hAnsi="Times New Roman" w:eastAsia="Times New Roman"/>
+          <w:b w:val="0"/>
+          <w:color w:val="000000"/>
+          <w:sz w:val="24"/>
+        </w:rPr>
+        <w:t xml:space="preserve"> que ya usaban la consola y la ventana, no se tocó ninguna clase del núcleo. Cambiar el CSV por otra forma de guardar es escribir otro adaptador de </w:t>
+      </w:r>
+      <w:r>
+        <w:rPr>
+          <w:rFonts w:ascii="Courier New" w:hAnsi="Courier New" w:eastAsia="Courier New"/>
+          <w:b w:val="0"/>
+          <w:color w:val="000000"/>
+          <w:sz w:val="20"/>
+        </w:rPr>
+        <w:t>IAccountStore</w:t>
+      </w:r>
+      <w:r>
+        <w:rPr>
+          <w:rFonts w:ascii="Times New Roman" w:hAnsi="Times New Roman" w:eastAsia="Times New Roman"/>
+          <w:b w:val="0"/>
+          <w:color w:val="000000"/>
+          <w:sz w:val="24"/>
+        </w:rPr>
+        <w:t>. Deshacer la jugada final revierte el resultado y rehacerla lo vuelve a sumar, para que una misma partida no cuente dos veces.</w:t>
+      </w:r>
+    </w:p>
+    <w:p>
+      <w:r>
+        <w:rPr>
+          <w:rFonts w:ascii="Times New Roman" w:hAnsi="Times New Roman" w:eastAsia="Times New Roman"/>
+          <w:b/>
+          <w:color w:val="000000"/>
+          <w:sz w:val="24"/>
+        </w:rPr>
+        <w:t>Cuándo se rompería.</w:t>
+      </w:r>
+      <w:r>
+        <w:rPr>
+          <w:rFonts w:ascii="Times New Roman" w:hAnsi="Times New Roman" w:eastAsia="Times New Roman"/>
+          <w:b w:val="0"/>
+          <w:color w:val="000000"/>
+          <w:sz w:val="24"/>
+        </w:rPr>
+        <w:t xml:space="preserve"> Con usuarios reales haría falta contraseña, y el CSV no soporta bien dos procesos escribiendo a la vez; ahí convendría una base de datos detrás del mismo puerto.</w:t>
+      </w:r>
+    </w:p>
+    <w:p>
+      <w:pPr>
+        <w:pStyle w:val="Heading1"/>
+      </w:pPr>
+      <w:r>
+        <w:rPr>
+          <w:rFonts w:ascii="Times New Roman" w:hAnsi="Times New Roman" w:eastAsia="Times New Roman"/>
+          <w:b/>
+          <w:color w:val="000000"/>
+          <w:sz w:val="28"/>
+        </w:rPr>
         <w:t>12. Tests del núcleo con un runner propio</w:t>
       </w:r>
     </w:p>
@@ -1965,7 +2237,25 @@
           <w:color w:val="000000"/>
           <w:sz w:val="24"/>
         </w:rPr>
-        <w:t>, con formato Arrange-Act-Assert, un stub (</w:t>
+        <w:t xml:space="preserve"> (y los de usuarios en </w:t>
+      </w:r>
+      <w:r>
+        <w:rPr>
+          <w:rFonts w:ascii="Courier New" w:hAnsi="Courier New" w:eastAsia="Courier New"/>
+          <w:b w:val="0"/>
+          <w:color w:val="000000"/>
+          <w:sz w:val="20"/>
+        </w:rPr>
+        <w:t>AccountTests</w:t>
+      </w:r>
+      <w:r>
+        <w:rPr>
+          <w:rFonts w:ascii="Times New Roman" w:hAnsi="Times New Roman" w:eastAsia="Times New Roman"/>
+          <w:b w:val="0"/>
+          <w:color w:val="000000"/>
+          <w:sz w:val="24"/>
+        </w:rPr>
+        <w:t>, con un almacén en memoria como fake), con formato Arrange-Act-Assert, un stub (</w:t>
       </w:r>
       <w:r>
         <w:rPr>

</xml_diff>

<commit_message>
La vista recibe la partida armada por GameBuilder, ventana adaptada al tamano del tablero y documentacion al dia
</commit_message>
<xml_diff>
--- a/docs/justificacion.docx
+++ b/docs/justificacion.docx
@@ -433,7 +433,61 @@
           <w:color w:val="000000"/>
           <w:sz w:val="24"/>
         </w:rPr>
-        <w:t xml:space="preserve"> arma la copia de búsqueda y los tests arman sus propios colaboradores.</w:t>
+        <w:t xml:space="preserve"> arma la copia de búsqueda y los tests arman sus propios colaboradores. En la ventana, cada vez que se aprieta Jugar la partida la arma un </w:t>
+      </w:r>
+      <w:r>
+        <w:rPr>
+          <w:rFonts w:ascii="Courier New" w:hAnsi="Courier New" w:eastAsia="Courier New"/>
+          <w:b w:val="0"/>
+          <w:color w:val="000000"/>
+          <w:sz w:val="20"/>
+        </w:rPr>
+        <w:t>GameBuilder</w:t>
+      </w:r>
+      <w:r>
+        <w:rPr>
+          <w:rFonts w:ascii="Times New Roman" w:hAnsi="Times New Roman" w:eastAsia="Times New Roman"/>
+          <w:b w:val="0"/>
+          <w:color w:val="000000"/>
+          <w:sz w:val="24"/>
+        </w:rPr>
+        <w:t xml:space="preserve"> que implementa </w:t>
+      </w:r>
+      <w:r>
+        <w:rPr>
+          <w:rFonts w:ascii="Courier New" w:hAnsi="Courier New" w:eastAsia="Courier New"/>
+          <w:b w:val="0"/>
+          <w:color w:val="000000"/>
+          <w:sz w:val="20"/>
+        </w:rPr>
+        <w:t>MainSwing</w:t>
+      </w:r>
+      <w:r>
+        <w:rPr>
+          <w:rFonts w:ascii="Times New Roman" w:hAnsi="Times New Roman" w:eastAsia="Times New Roman"/>
+          <w:b w:val="0"/>
+          <w:color w:val="000000"/>
+          <w:sz w:val="24"/>
+        </w:rPr>
+        <w:t xml:space="preserve">: devuelve el juego, el que acredita los puntos y, si corresponde, la IA. La vista no crea ninguno de esos colaboradores con </w:t>
+      </w:r>
+      <w:r>
+        <w:rPr>
+          <w:rFonts w:ascii="Courier New" w:hAnsi="Courier New" w:eastAsia="Courier New"/>
+          <w:b w:val="0"/>
+          <w:color w:val="000000"/>
+          <w:sz w:val="20"/>
+        </w:rPr>
+        <w:t>new</w:t>
+      </w:r>
+      <w:r>
+        <w:rPr>
+          <w:rFonts w:ascii="Times New Roman" w:hAnsi="Times New Roman" w:eastAsia="Times New Roman"/>
+          <w:b w:val="0"/>
+          <w:color w:val="000000"/>
+          <w:sz w:val="24"/>
+        </w:rPr>
+        <w:t>.</w:t>
       </w:r>
     </w:p>
     <w:p>

</xml_diff>

<commit_message>
Documentacion al dia y fuera los documentos de trabajo viejos
README, justificacion (y su docx), cambios de usuarios, lista del UML y presentacion con los
paquetes en ingles, StandardRules, el Decorator en las dos interfaces, BoardView, rehacer que
vuelve a anunciar el final y los conteos de pruebas. Se borran los planes de docs/superpowers,
ui-review.md y estado-final.md, que eran notas de trabajo y no entregables.
</commit_message>
<xml_diff>
--- a/docs/justificacion.docx
+++ b/docs/justificacion.docx
@@ -78,7 +78,7 @@
           <w:color w:val="000000"/>
           <w:sz w:val="20"/>
         </w:rPr>
-        <w:t>nucleo</w:t>
+        <w:t>core</w:t>
       </w:r>
       <w:r>
         <w:rPr>
@@ -96,7 +96,7 @@
           <w:color w:val="000000"/>
           <w:sz w:val="20"/>
         </w:rPr>
-        <w:t>adaptadores</w:t>
+        <w:t>adapters</w:t>
       </w:r>
       <w:r>
         <w:rPr>
@@ -1345,7 +1345,43 @@
           <w:color w:val="000000"/>
           <w:sz w:val="24"/>
         </w:rPr>
-        <w:t>. Agregar una regla nueva obligaba a modificarlo. Ahora es una clase nueva y una línea en el composition root (Open/Closed).</w:t>
+        <w:t xml:space="preserve">. Agregar una regla nueva obligaba a modificarlo. Ahora es una clase nueva y una línea en </w:t>
+      </w:r>
+      <w:r>
+        <w:rPr>
+          <w:rFonts w:ascii="Courier New" w:hAnsi="Courier New" w:eastAsia="Courier New"/>
+          <w:b w:val="0"/>
+          <w:color w:val="000000"/>
+          <w:sz w:val="20"/>
+        </w:rPr>
+        <w:t>StandardRules</w:t>
+      </w:r>
+      <w:r>
+        <w:rPr>
+          <w:rFonts w:ascii="Times New Roman" w:hAnsi="Times New Roman" w:eastAsia="Times New Roman"/>
+          <w:b w:val="0"/>
+          <w:color w:val="000000"/>
+          <w:sz w:val="24"/>
+        </w:rPr>
+        <w:t xml:space="preserve">, la fábrica que arma las reglas de siempre para la consola, la ventana y la búsqueda de la IA (Open/Closed). </w:t>
+      </w:r>
+      <w:r>
+        <w:rPr>
+          <w:rFonts w:ascii="Courier New" w:hAnsi="Courier New" w:eastAsia="Courier New"/>
+          <w:b w:val="0"/>
+          <w:color w:val="000000"/>
+          <w:sz w:val="20"/>
+        </w:rPr>
+        <w:t>ChessGame</w:t>
+      </w:r>
+      <w:r>
+        <w:rPr>
+          <w:rFonts w:ascii="Times New Roman" w:hAnsi="Times New Roman" w:eastAsia="Times New Roman"/>
+          <w:b w:val="0"/>
+          <w:color w:val="000000"/>
+          <w:sz w:val="24"/>
+        </w:rPr>
+        <w:t xml:space="preserve"> sigue sin saber cuáles son.</w:t>
       </w:r>
     </w:p>
     <w:p>
@@ -2010,7 +2046,7 @@
           <w:color w:val="000000"/>
           <w:sz w:val="20"/>
         </w:rPr>
-        <w:t>usuarios</w:t>
+        <w:t>accounts</w:t>
       </w:r>
       <w:r>
         <w:rPr>
@@ -2648,7 +2684,7 @@
           <w:color w:val="000000"/>
           <w:sz w:val="24"/>
         </w:rPr>
-        <w:t xml:space="preserve"> sí usa Decorator: envuelve al selector humano y elige reina automáticamente para el bando de la IA.</w:t>
+        <w:t xml:space="preserve"> sí usa Decorator: envuelve al selector humano y elige reina automáticamente para el bando de la IA, en la consola y en la ventana.</w:t>
       </w:r>
     </w:p>
     <w:sectPr>

</xml_diff>

<commit_message>
Integro el login separado y las skins, sin juego por LAN
El 1 contra 1 queda sin puntos y el login va antes del menu. Mantengo los arreglos de main y actualizo las pruebas y la documentacion que dependian de estos cambios.
</commit_message>
<xml_diff>
--- a/docs/justificacion.docx
+++ b/docs/justificacion.docx
@@ -105,7 +105,7 @@
           <w:color w:val="000000"/>
           <w:sz w:val="24"/>
         </w:rPr>
-        <w:t xml:space="preserve"> ni de </w:t>
+        <w:t xml:space="preserve">, </w:t>
       </w:r>
       <w:r>
         <w:rPr>
@@ -114,7 +114,7 @@
           <w:color w:val="000000"/>
           <w:sz w:val="20"/>
         </w:rPr>
-        <w:t>ai</w:t>
+        <w:t>accounts</w:t>
       </w:r>
       <w:r>
         <w:rPr>
@@ -123,7 +123,43 @@
           <w:color w:val="000000"/>
           <w:sz w:val="24"/>
         </w:rPr>
-        <w:t>. La consola, la ventana y la IA son piezas externas que dependen del núcleo, nunca al revés.</w:t>
+        <w:t xml:space="preserve">, </w:t>
+      </w:r>
+      <w:r>
+        <w:rPr>
+          <w:rFonts w:ascii="Courier New" w:hAnsi="Courier New" w:eastAsia="Courier New"/>
+          <w:b w:val="0"/>
+          <w:color w:val="000000"/>
+          <w:sz w:val="20"/>
+        </w:rPr>
+        <w:t>skins</w:t>
+      </w:r>
+      <w:r>
+        <w:rPr>
+          <w:rFonts w:ascii="Times New Roman" w:hAnsi="Times New Roman" w:eastAsia="Times New Roman"/>
+          <w:b w:val="0"/>
+          <w:color w:val="000000"/>
+          <w:sz w:val="24"/>
+        </w:rPr>
+        <w:t xml:space="preserve"> ni </w:t>
+      </w:r>
+      <w:r>
+        <w:rPr>
+          <w:rFonts w:ascii="Courier New" w:hAnsi="Courier New" w:eastAsia="Courier New"/>
+          <w:b w:val="0"/>
+          <w:color w:val="000000"/>
+          <w:sz w:val="20"/>
+        </w:rPr>
+        <w:t>ai</w:t>
+      </w:r>
+      <w:r>
+        <w:rPr>
+          <w:rFonts w:ascii="Times New Roman" w:hAnsi="Times New Roman" w:eastAsia="Times New Roman"/>
+          <w:b w:val="0"/>
+          <w:color w:val="000000"/>
+          <w:sz w:val="24"/>
+        </w:rPr>
+        <w:t>. La consola, la ventana, los usuarios y la IA son piezas externas que dependen del núcleo, nunca al revés.</w:t>
       </w:r>
     </w:p>
     <w:p>
@@ -181,7 +217,43 @@
           <w:color w:val="000000"/>
           <w:sz w:val="24"/>
         </w:rPr>
-        <w:t xml:space="preserve"> Si el sistema fuera un prototipo descartable de pocos días, separar en paquetes sería sobre-ingeniería. Acá el sistema tiene que crecer (más reglas, otras interfaces) y se defiende oralmente, así que la frontera paga.</w:t>
+        <w:t xml:space="preserve"> Si el TP fuera solo la consola, sin ventana ni IA, </w:t>
+      </w:r>
+      <w:r>
+        <w:rPr>
+          <w:rFonts w:ascii="Courier New" w:hAnsi="Courier New" w:eastAsia="Courier New"/>
+          <w:b w:val="0"/>
+          <w:color w:val="000000"/>
+          <w:sz w:val="20"/>
+        </w:rPr>
+        <w:t>ChessGame</w:t>
+      </w:r>
+      <w:r>
+        <w:rPr>
+          <w:rFonts w:ascii="Times New Roman" w:hAnsi="Times New Roman" w:eastAsia="Times New Roman"/>
+          <w:b w:val="0"/>
+          <w:color w:val="000000"/>
+          <w:sz w:val="24"/>
+        </w:rPr>
+        <w:t xml:space="preserve"> podría imprimir directo y los puertos serían de más. La frontera pagó cuando agregamos la ventana, la IA y los usuarios sin tocar </w:t>
+      </w:r>
+      <w:r>
+        <w:rPr>
+          <w:rFonts w:ascii="Courier New" w:hAnsi="Courier New" w:eastAsia="Courier New"/>
+          <w:b w:val="0"/>
+          <w:color w:val="000000"/>
+          <w:sz w:val="20"/>
+        </w:rPr>
+        <w:t>ChessGame</w:t>
+      </w:r>
+      <w:r>
+        <w:rPr>
+          <w:rFonts w:ascii="Times New Roman" w:hAnsi="Times New Roman" w:eastAsia="Times New Roman"/>
+          <w:b w:val="0"/>
+          <w:color w:val="000000"/>
+          <w:sz w:val="24"/>
+        </w:rPr>
+        <w:t>.</w:t>
       </w:r>
     </w:p>
     <w:p>
@@ -433,7 +505,7 @@
           <w:color w:val="000000"/>
           <w:sz w:val="24"/>
         </w:rPr>
-        <w:t xml:space="preserve"> arma la copia de búsqueda y los tests arman sus propios colaboradores. En la ventana, cada vez que se aprieta Jugar la partida la arma un </w:t>
+        <w:t xml:space="preserve"> arma la copia de búsqueda y los tests arman sus propios colaboradores. En la ventana, cada partida la arma un </w:t>
       </w:r>
       <w:r>
         <w:rPr>
@@ -469,7 +541,61 @@
           <w:color w:val="000000"/>
           <w:sz w:val="24"/>
         </w:rPr>
-        <w:t xml:space="preserve">: devuelve el juego, el que acredita los puntos y, si corresponde, la IA. La vista no crea ninguno de esos colaboradores con </w:t>
+        <w:t xml:space="preserve">, con un método: </w:t>
+      </w:r>
+      <w:r>
+        <w:rPr>
+          <w:rFonts w:ascii="Courier New" w:hAnsi="Courier New" w:eastAsia="Courier New"/>
+          <w:b w:val="0"/>
+          <w:color w:val="000000"/>
+          <w:sz w:val="20"/>
+        </w:rPr>
+        <w:t>local</w:t>
+      </w:r>
+      <w:r>
+        <w:rPr>
+          <w:rFonts w:ascii="Times New Roman" w:hAnsi="Times New Roman" w:eastAsia="Times New Roman"/>
+          <w:b w:val="0"/>
+          <w:color w:val="000000"/>
+          <w:sz w:val="24"/>
+        </w:rPr>
+        <w:t xml:space="preserve"> (1 contra 1 o contra la IA). Devuelve el juego, el que acredita los puntos y, si corresponde, la IA. </w:t>
+      </w:r>
+      <w:r>
+        <w:rPr>
+          <w:rFonts w:ascii="Courier New" w:hAnsi="Courier New" w:eastAsia="Courier New"/>
+          <w:b w:val="0"/>
+          <w:color w:val="000000"/>
+          <w:sz w:val="20"/>
+        </w:rPr>
+        <w:t>GameBuilder</w:t>
+      </w:r>
+      <w:r>
+        <w:rPr>
+          <w:rFonts w:ascii="Times New Roman" w:hAnsi="Times New Roman" w:eastAsia="Times New Roman"/>
+          <w:b w:val="0"/>
+          <w:color w:val="000000"/>
+          <w:sz w:val="24"/>
+        </w:rPr>
+        <w:t xml:space="preserve"> recibe un </w:t>
+      </w:r>
+      <w:r>
+        <w:rPr>
+          <w:rFonts w:ascii="Courier New" w:hAnsi="Courier New" w:eastAsia="Courier New"/>
+          <w:b w:val="0"/>
+          <w:color w:val="000000"/>
+          <w:sz w:val="20"/>
+        </w:rPr>
+        <w:t>IGameView</w:t>
+      </w:r>
+      <w:r>
+        <w:rPr>
+          <w:rFonts w:ascii="Times New Roman" w:hAnsi="Times New Roman" w:eastAsia="Times New Roman"/>
+          <w:b w:val="0"/>
+          <w:color w:val="000000"/>
+          <w:sz w:val="24"/>
+        </w:rPr>
+        <w:t xml:space="preserve"> (lo que la partida necesita de una pantalla), no la ventana concreta. La vista no crea ninguno de esos colaboradores con </w:t>
       </w:r>
       <w:r>
         <w:rPr>
@@ -1363,25 +1489,7 @@
           <w:color w:val="000000"/>
           <w:sz w:val="24"/>
         </w:rPr>
-        <w:t xml:space="preserve">, la fábrica que arma las reglas de siempre para la consola, la ventana y la búsqueda de la IA (Open/Closed). </w:t>
-      </w:r>
-      <w:r>
-        <w:rPr>
-          <w:rFonts w:ascii="Courier New" w:hAnsi="Courier New" w:eastAsia="Courier New"/>
-          <w:b w:val="0"/>
-          <w:color w:val="000000"/>
-          <w:sz w:val="20"/>
-        </w:rPr>
-        <w:t>ChessGame</w:t>
-      </w:r>
-      <w:r>
-        <w:rPr>
-          <w:rFonts w:ascii="Times New Roman" w:hAnsi="Times New Roman" w:eastAsia="Times New Roman"/>
-          <w:b w:val="0"/>
-          <w:color w:val="000000"/>
-          <w:sz w:val="24"/>
-        </w:rPr>
-        <w:t xml:space="preserve"> sigue sin saber cuáles son.</w:t>
+        <w:t>, que arma las reglas de siempre para la consola, la ventana y la búsqueda de la IA (Open/Closed).</w:t>
       </w:r>
     </w:p>
     <w:p>
@@ -1543,7 +1651,7 @@
           <w:color w:val="000000"/>
           <w:sz w:val="24"/>
         </w:rPr>
-        <w:t xml:space="preserve">). No hay un booleano </w:t>
+        <w:t xml:space="preserve">). Cada estado dice de quién es el turno y si la partida terminó. Las transiciones a mate, ahogado o tablas no las deciden los estados: las decide </w:t>
       </w:r>
       <w:r>
         <w:rPr>
@@ -1552,7 +1660,7 @@
           <w:color w:val="000000"/>
           <w:sz w:val="20"/>
         </w:rPr>
-        <w:t>gameOver</w:t>
+        <w:t>ChessGame</w:t>
       </w:r>
       <w:r>
         <w:rPr>
@@ -1561,7 +1669,7 @@
           <w:color w:val="000000"/>
           <w:sz w:val="24"/>
         </w:rPr>
-        <w:t>.</w:t>
+        <w:t xml:space="preserve"> después de cada jugada, porque es el único que conoce el tablero y las reglas.</w:t>
       </w:r>
     </w:p>
     <w:p>
@@ -1581,7 +1689,25 @@
           <w:color w:val="000000"/>
           <w:sz w:val="24"/>
         </w:rPr>
-        <w:t xml:space="preserve"> Antes el patrón era dos estados triviales y un booleano aparte, es decir, el patrón usado a medias. Con los estados terminales el patrón resuelve un problema real: de un estado terminal no se sale jugando, y deshacer vuelve al estado anterior sin trucos.</w:t>
+        <w:t xml:space="preserve"> No hay un booleano </w:t>
+      </w:r>
+      <w:r>
+        <w:rPr>
+          <w:rFonts w:ascii="Courier New" w:hAnsi="Courier New" w:eastAsia="Courier New"/>
+          <w:b w:val="0"/>
+          <w:color w:val="000000"/>
+          <w:sz w:val="20"/>
+        </w:rPr>
+        <w:t>gameOver</w:t>
+      </w:r>
+      <w:r>
+        <w:rPr>
+          <w:rFonts w:ascii="Times New Roman" w:hAnsi="Times New Roman" w:eastAsia="Times New Roman"/>
+          <w:b w:val="0"/>
+          <w:color w:val="000000"/>
+          <w:sz w:val="24"/>
+        </w:rPr>
+        <w:t xml:space="preserve"> suelto: el historial guarda el estado de antes y el de después de cada jugada, y deshacer o rehacer vuelve a ese estado sin recalcular nada.</w:t>
       </w:r>
     </w:p>
     <w:p>
@@ -1601,7 +1727,7 @@
           <w:color w:val="000000"/>
           <w:sz w:val="24"/>
         </w:rPr>
-        <w:t xml:space="preserve"> Con solo dos estados estables un enum y un </w:t>
+        <w:t xml:space="preserve"> Es un State a medio camino, y lo decimos así: si aparecieran más fases (abandono, tiempo agotado, tablas por acuerdo), convendría que cada estado decida su transición, porque si no hay que tocar </w:t>
       </w:r>
       <w:r>
         <w:rPr>
@@ -1610,7 +1736,7 @@
           <w:color w:val="000000"/>
           <w:sz w:val="20"/>
         </w:rPr>
-        <w:t>switch</w:t>
+        <w:t>ChessGame</w:t>
       </w:r>
       <w:r>
         <w:rPr>
@@ -1619,7 +1745,7 @@
           <w:color w:val="000000"/>
           <w:sz w:val="24"/>
         </w:rPr>
-        <w:t xml:space="preserve"> serían más claros. Se justifica por los estados terminales, que cambian el comportamiento de las jugadas.</w:t>
+        <w:t xml:space="preserve"> por cada una. Si el grupo prefiere lo más simple, con el color al turno y un resultado alcanzaría.</w:t>
       </w:r>
     </w:p>
     <w:p>
@@ -2145,7 +2271,25 @@
           <w:color w:val="000000"/>
           <w:sz w:val="24"/>
         </w:rPr>
-        <w:t>) con un adaptador de archivo CSV (</w:t>
+        <w:t xml:space="preserve">, en el mismo paquete </w:t>
+      </w:r>
+      <w:r>
+        <w:rPr>
+          <w:rFonts w:ascii="Courier New" w:hAnsi="Courier New" w:eastAsia="Courier New"/>
+          <w:b w:val="0"/>
+          <w:color w:val="000000"/>
+          <w:sz w:val="20"/>
+        </w:rPr>
+        <w:t>accounts</w:t>
+      </w:r>
+      <w:r>
+        <w:rPr>
+          <w:rFonts w:ascii="Times New Roman" w:hAnsi="Times New Roman" w:eastAsia="Times New Roman"/>
+          <w:b w:val="0"/>
+          <w:color w:val="000000"/>
+          <w:sz w:val="24"/>
+        </w:rPr>
+        <w:t>: es el puerto que necesitan las cuentas, no el núcleo) con un adaptador de archivo CSV (</w:t>
       </w:r>
       <w:r>
         <w:rPr>
@@ -2289,7 +2433,7 @@
           <w:color w:val="000000"/>
           <w:sz w:val="28"/>
         </w:rPr>
-        <w:t>12. Tests del núcleo con un runner propio</w:t>
+        <w:t>15. El tablero de la ventana es su propio componente y sigue a la ventana</w:t>
       </w:r>
     </w:p>
     <w:p>
@@ -2309,7 +2453,7 @@
           <w:color w:val="000000"/>
           <w:sz w:val="24"/>
         </w:rPr>
-        <w:t xml:space="preserve"> Los tests están en </w:t>
+        <w:t xml:space="preserve"> </w:t>
       </w:r>
       <w:r>
         <w:rPr>
@@ -2318,7 +2462,7 @@
           <w:color w:val="000000"/>
           <w:sz w:val="20"/>
         </w:rPr>
-        <w:t>ChessCoreTests</w:t>
+        <w:t>BoardView</w:t>
       </w:r>
       <w:r>
         <w:rPr>
@@ -2327,7 +2471,7 @@
           <w:color w:val="000000"/>
           <w:sz w:val="24"/>
         </w:rPr>
-        <w:t xml:space="preserve"> (y los de usuarios en </w:t>
+        <w:t xml:space="preserve"> dibuja las casillas, las coordenadas y las piezas; </w:t>
       </w:r>
       <w:r>
         <w:rPr>
@@ -2336,7 +2480,7 @@
           <w:color w:val="000000"/>
           <w:sz w:val="20"/>
         </w:rPr>
-        <w:t>AccountTests</w:t>
+        <w:t>SwingChessView</w:t>
       </w:r>
       <w:r>
         <w:rPr>
@@ -2345,7 +2489,7 @@
           <w:color w:val="000000"/>
           <w:sz w:val="24"/>
         </w:rPr>
-        <w:t>, con un almacén en memoria como fake), con formato Arrange-Act-Assert, un stub (</w:t>
+        <w:t xml:space="preserve"> maneja las pantallas y el turno. Cuando la ventana cambia de tamaño, </w:t>
       </w:r>
       <w:r>
         <w:rPr>
@@ -2354,7 +2498,7 @@
           <w:color w:val="000000"/>
           <w:sz w:val="20"/>
         </w:rPr>
-        <w:t>AlwaysQueenChooser</w:t>
+        <w:t>BoardView.fitTo</w:t>
       </w:r>
       <w:r>
         <w:rPr>
@@ -2363,7 +2507,7 @@
           <w:color w:val="000000"/>
           <w:sz w:val="24"/>
         </w:rPr>
-        <w:t>), un mock (</w:t>
+        <w:t xml:space="preserve"> calcula el lado de casilla que entra y las piezas se vuelven a armar a ese tamaño, con imágenes de varias resoluciones (</w:t>
       </w:r>
       <w:r>
         <w:rPr>
@@ -2372,7 +2516,7 @@
           <w:color w:val="000000"/>
           <w:sz w:val="20"/>
         </w:rPr>
-        <w:t>RecordingObserver</w:t>
+        <w:t>SmoothImage</w:t>
       </w:r>
       <w:r>
         <w:rPr>
@@ -2381,16 +2525,18 @@
           <w:color w:val="000000"/>
           <w:sz w:val="24"/>
         </w:rPr>
-        <w:t xml:space="preserve">) y los marcados con </w:t>
-      </w:r>
-      <w:r>
-        <w:rPr>
-          <w:rFonts w:ascii="Courier New" w:hAnsi="Courier New" w:eastAsia="Courier New"/>
-          <w:b w:val="0"/>
-          <w:color w:val="000000"/>
-          <w:sz w:val="20"/>
-        </w:rPr>
-        <w:t>// TDD:</w:t>
+        <w:t>) para que se vean nítidas con la pantalla escalada (125 %, 150 %, Retina).</w:t>
+      </w:r>
+    </w:p>
+    <w:p>
+      <w:r>
+        <w:rPr>
+          <w:rFonts w:ascii="Times New Roman" w:hAnsi="Times New Roman" w:eastAsia="Times New Roman"/>
+          <w:b/>
+          <w:color w:val="000000"/>
+          <w:sz w:val="24"/>
+        </w:rPr>
+        <w:t>Por qué.</w:t>
       </w:r>
       <w:r>
         <w:rPr>
@@ -2399,16 +2545,18 @@
           <w:color w:val="000000"/>
           <w:sz w:val="24"/>
         </w:rPr>
-        <w:t xml:space="preserve"> escritos antes que el código. Se corren con </w:t>
-      </w:r>
-      <w:r>
-        <w:rPr>
-          <w:rFonts w:ascii="Courier New" w:hAnsi="Courier New" w:eastAsia="Courier New"/>
-          <w:b w:val="0"/>
-          <w:color w:val="000000"/>
-          <w:sz w:val="20"/>
-        </w:rPr>
-        <w:t>./scripts/test.sh</w:t>
+        <w:t xml:space="preserve"> La ventana tenía unas 670 líneas con todo mezclado. Separar el tablero lo hizo más fácil de leer y permitió el requisito no funcional de que se vea bien en cualquier tamaño y pantalla. Rehacer doce piezas en varias resoluciones cuesta, así que se rehacen cuando se deja de arrastrar el borde (Unidad 4: no pagar el costo en cada evento). Es una decisión de experiencia de uso: no se midió con un profiler.</w:t>
+      </w:r>
+    </w:p>
+    <w:p>
+      <w:r>
+        <w:rPr>
+          <w:rFonts w:ascii="Times New Roman" w:hAnsi="Times New Roman" w:eastAsia="Times New Roman"/>
+          <w:b/>
+          <w:color w:val="000000"/>
+          <w:sz w:val="24"/>
+        </w:rPr>
+        <w:t>Cuándo se rompería.</w:t>
       </w:r>
       <w:r>
         <w:rPr>
@@ -2417,65 +2565,7 @@
           <w:color w:val="000000"/>
           <w:sz w:val="24"/>
         </w:rPr>
-        <w:t xml:space="preserve"> y no usan librerías.</w:t>
-      </w:r>
-    </w:p>
-    <w:p>
-      <w:r>
-        <w:rPr>
-          <w:rFonts w:ascii="Times New Roman" w:hAnsi="Times New Roman" w:eastAsia="Times New Roman"/>
-          <w:b/>
-          <w:color w:val="000000"/>
-          <w:sz w:val="24"/>
-        </w:rPr>
-        <w:t>Por qué.</w:t>
-      </w:r>
-      <w:r>
-        <w:rPr>
-          <w:rFonts w:ascii="Times New Roman" w:hAnsi="Times New Roman" w:eastAsia="Times New Roman"/>
-          <w:b w:val="0"/>
-          <w:color w:val="000000"/>
-          <w:sz w:val="24"/>
-        </w:rPr>
-        <w:t xml:space="preserve"> Corren solo con </w:t>
-      </w:r>
-      <w:r>
-        <w:rPr>
-          <w:rFonts w:ascii="Courier New" w:hAnsi="Courier New" w:eastAsia="Courier New"/>
-          <w:b w:val="0"/>
-          <w:color w:val="000000"/>
-          <w:sz w:val="20"/>
-        </w:rPr>
-        <w:t>javac</w:t>
-      </w:r>
-      <w:r>
-        <w:rPr>
-          <w:rFonts w:ascii="Times New Roman" w:hAnsi="Times New Roman" w:eastAsia="Times New Roman"/>
-          <w:b w:val="0"/>
-          <w:color w:val="000000"/>
-          <w:sz w:val="24"/>
-        </w:rPr>
-        <w:t>, sin infraestructura, que es lo que pide la consigna, y no hay nada para instalar ni explicar en la defensa.</w:t>
-      </w:r>
-    </w:p>
-    <w:p>
-      <w:r>
-        <w:rPr>
-          <w:rFonts w:ascii="Times New Roman" w:hAnsi="Times New Roman" w:eastAsia="Times New Roman"/>
-          <w:b/>
-          <w:color w:val="000000"/>
-          <w:sz w:val="24"/>
-        </w:rPr>
-        <w:t>Cuándo se rompería.</w:t>
-      </w:r>
-      <w:r>
-        <w:rPr>
-          <w:rFonts w:ascii="Times New Roman" w:hAnsi="Times New Roman" w:eastAsia="Times New Roman"/>
-          <w:b w:val="0"/>
-          <w:color w:val="000000"/>
-          <w:sz w:val="24"/>
-        </w:rPr>
-        <w:t xml:space="preserve"> En un proyecto real con un equipo grande convendría JUnit, por el reporte, los filtros y la integración con las herramientas.</w:t>
+        <w:t xml:space="preserve"> Si la ventana tuviera un tamaño fijo, recalcular las casillas sería trabajo de más.</w:t>
       </w:r>
     </w:p>
     <w:p>
@@ -2489,7 +2579,535 @@
           <w:color w:val="000000"/>
           <w:sz w:val="28"/>
         </w:rPr>
-        <w:t>13. Simplificaciones declaradas</w:t>
+        <w:t>16. Los recursos se leen del classpath</w:t>
+      </w:r>
+    </w:p>
+    <w:p>
+      <w:r>
+        <w:rPr>
+          <w:rFonts w:ascii="Times New Roman" w:hAnsi="Times New Roman" w:eastAsia="Times New Roman"/>
+          <w:b/>
+          <w:color w:val="000000"/>
+          <w:sz w:val="24"/>
+        </w:rPr>
+        <w:t>Qué.</w:t>
+      </w:r>
+      <w:r>
+        <w:rPr>
+          <w:rFonts w:ascii="Times New Roman" w:hAnsi="Times New Roman" w:eastAsia="Times New Roman"/>
+          <w:b w:val="0"/>
+          <w:color w:val="000000"/>
+          <w:sz w:val="24"/>
+        </w:rPr>
+        <w:t xml:space="preserve"> El ícono, las piezas y el catálogo de skins se leen del classpath (</w:t>
+      </w:r>
+      <w:r>
+        <w:rPr>
+          <w:rFonts w:ascii="Courier New" w:hAnsi="Courier New" w:eastAsia="Courier New"/>
+          <w:b w:val="0"/>
+          <w:color w:val="000000"/>
+          <w:sz w:val="20"/>
+        </w:rPr>
+        <w:t>Assets</w:t>
+      </w:r>
+      <w:r>
+        <w:rPr>
+          <w:rFonts w:ascii="Times New Roman" w:hAnsi="Times New Roman" w:eastAsia="Times New Roman"/>
+          <w:b w:val="0"/>
+          <w:color w:val="000000"/>
+          <w:sz w:val="24"/>
+        </w:rPr>
+        <w:t xml:space="preserve">), no de </w:t>
+      </w:r>
+      <w:r>
+        <w:rPr>
+          <w:rFonts w:ascii="Courier New" w:hAnsi="Courier New" w:eastAsia="Courier New"/>
+          <w:b w:val="0"/>
+          <w:color w:val="000000"/>
+          <w:sz w:val="20"/>
+        </w:rPr>
+        <w:t>src/assets/...</w:t>
+      </w:r>
+      <w:r>
+        <w:rPr>
+          <w:rFonts w:ascii="Times New Roman" w:hAnsi="Times New Roman" w:eastAsia="Times New Roman"/>
+          <w:b w:val="0"/>
+          <w:color w:val="000000"/>
+          <w:sz w:val="24"/>
+        </w:rPr>
+        <w:t xml:space="preserve">. El ícono va con </w:t>
+      </w:r>
+      <w:r>
+        <w:rPr>
+          <w:rFonts w:ascii="Courier New" w:hAnsi="Courier New" w:eastAsia="Courier New"/>
+          <w:b w:val="0"/>
+          <w:color w:val="000000"/>
+          <w:sz w:val="20"/>
+        </w:rPr>
+        <w:t>setIconImages</w:t>
+      </w:r>
+      <w:r>
+        <w:rPr>
+          <w:rFonts w:ascii="Times New Roman" w:hAnsi="Times New Roman" w:eastAsia="Times New Roman"/>
+          <w:b w:val="0"/>
+          <w:color w:val="000000"/>
+          <w:sz w:val="24"/>
+        </w:rPr>
+        <w:t xml:space="preserve"> y, en macOS, con </w:t>
+      </w:r>
+      <w:r>
+        <w:rPr>
+          <w:rFonts w:ascii="Courier New" w:hAnsi="Courier New" w:eastAsia="Courier New"/>
+          <w:b w:val="0"/>
+          <w:color w:val="000000"/>
+          <w:sz w:val="20"/>
+        </w:rPr>
+        <w:t>Taskbar</w:t>
+      </w:r>
+      <w:r>
+        <w:rPr>
+          <w:rFonts w:ascii="Times New Roman" w:hAnsi="Times New Roman" w:eastAsia="Times New Roman"/>
+          <w:b w:val="0"/>
+          <w:color w:val="000000"/>
+          <w:sz w:val="24"/>
+        </w:rPr>
+        <w:t>.</w:t>
+      </w:r>
+    </w:p>
+    <w:p>
+      <w:r>
+        <w:rPr>
+          <w:rFonts w:ascii="Times New Roman" w:hAnsi="Times New Roman" w:eastAsia="Times New Roman"/>
+          <w:b/>
+          <w:color w:val="000000"/>
+          <w:sz w:val="24"/>
+        </w:rPr>
+        <w:t>Por qué.</w:t>
+      </w:r>
+      <w:r>
+        <w:rPr>
+          <w:rFonts w:ascii="Times New Roman" w:hAnsi="Times New Roman" w:eastAsia="Times New Roman"/>
+          <w:b w:val="0"/>
+          <w:color w:val="000000"/>
+          <w:sz w:val="24"/>
+        </w:rPr>
+        <w:t xml:space="preserve"> Con la ruta relativa el juego dependía de la carpeta desde la que se ejecutaba, y el ícono solo aparecía en Windows. Es un requisito no funcional: tiene que andar igual en las PCs del grupo.</w:t>
+      </w:r>
+    </w:p>
+    <w:p>
+      <w:r>
+        <w:rPr>
+          <w:rFonts w:ascii="Times New Roman" w:hAnsi="Times New Roman" w:eastAsia="Times New Roman"/>
+          <w:b/>
+          <w:color w:val="000000"/>
+          <w:sz w:val="24"/>
+        </w:rPr>
+        <w:t>Cuándo se rompería.</w:t>
+      </w:r>
+      <w:r>
+        <w:rPr>
+          <w:rFonts w:ascii="Times New Roman" w:hAnsi="Times New Roman" w:eastAsia="Times New Roman"/>
+          <w:b w:val="0"/>
+          <w:color w:val="000000"/>
+          <w:sz w:val="24"/>
+        </w:rPr>
+        <w:t xml:space="preserve"> Si los recursos tuvieran que poder cambiarse sin recompilar (por ejemplo, skins que agrega el usuario), habría que leerlos de una carpeta configurable además del classpath.</w:t>
+      </w:r>
+    </w:p>
+    <w:p>
+      <w:pPr>
+        <w:pStyle w:val="Heading1"/>
+      </w:pPr>
+      <w:r>
+        <w:rPr>
+          <w:rFonts w:ascii="Times New Roman" w:hAnsi="Times New Roman" w:eastAsia="Times New Roman"/>
+          <w:b/>
+          <w:color w:val="000000"/>
+          <w:sz w:val="28"/>
+        </w:rPr>
+        <w:t>17. Las skins son datos, y sin derechos de terceros</w:t>
+      </w:r>
+    </w:p>
+    <w:p>
+      <w:r>
+        <w:rPr>
+          <w:rFonts w:ascii="Times New Roman" w:hAnsi="Times New Roman" w:eastAsia="Times New Roman"/>
+          <w:b/>
+          <w:color w:val="000000"/>
+          <w:sz w:val="24"/>
+        </w:rPr>
+        <w:t>Qué.</w:t>
+      </w:r>
+      <w:r>
+        <w:rPr>
+          <w:rFonts w:ascii="Times New Roman" w:hAnsi="Times New Roman" w:eastAsia="Times New Roman"/>
+          <w:b w:val="0"/>
+          <w:color w:val="000000"/>
+          <w:sz w:val="24"/>
+        </w:rPr>
+        <w:t xml:space="preserve"> El catálogo de skins es un archivo (</w:t>
+      </w:r>
+      <w:r>
+        <w:rPr>
+          <w:rFonts w:ascii="Courier New" w:hAnsi="Courier New" w:eastAsia="Courier New"/>
+          <w:b w:val="0"/>
+          <w:color w:val="000000"/>
+          <w:sz w:val="20"/>
+        </w:rPr>
+        <w:t>assets/skins/skins.csv</w:t>
+      </w:r>
+      <w:r>
+        <w:rPr>
+          <w:rFonts w:ascii="Times New Roman" w:hAnsi="Times New Roman" w:eastAsia="Times New Roman"/>
+          <w:b w:val="0"/>
+          <w:color w:val="000000"/>
+          <w:sz w:val="24"/>
+        </w:rPr>
+        <w:t xml:space="preserve">) más una carpeta con las 12 piezas. </w:t>
+      </w:r>
+      <w:r>
+        <w:rPr>
+          <w:rFonts w:ascii="Courier New" w:hAnsi="Courier New" w:eastAsia="Courier New"/>
+          <w:b w:val="0"/>
+          <w:color w:val="000000"/>
+          <w:sz w:val="20"/>
+        </w:rPr>
+        <w:t>SkinService</w:t>
+      </w:r>
+      <w:r>
+        <w:rPr>
+          <w:rFonts w:ascii="Times New Roman" w:hAnsi="Times New Roman" w:eastAsia="Times New Roman"/>
+          <w:b w:val="0"/>
+          <w:color w:val="000000"/>
+          <w:sz w:val="24"/>
+        </w:rPr>
+        <w:t xml:space="preserve"> decide cuáles están desbloqueadas por los puntos del ranking y la elegida se guarda por el puerto </w:t>
+      </w:r>
+      <w:r>
+        <w:rPr>
+          <w:rFonts w:ascii="Courier New" w:hAnsi="Courier New" w:eastAsia="Courier New"/>
+          <w:b w:val="0"/>
+          <w:color w:val="000000"/>
+          <w:sz w:val="20"/>
+        </w:rPr>
+        <w:t>ISkinStore</w:t>
+      </w:r>
+      <w:r>
+        <w:rPr>
+          <w:rFonts w:ascii="Times New Roman" w:hAnsi="Times New Roman" w:eastAsia="Times New Roman"/>
+          <w:b w:val="0"/>
+          <w:color w:val="000000"/>
+          <w:sz w:val="24"/>
+        </w:rPr>
+        <w:t>. Solo se incluyen imágenes con licencia que lo permita y con autor citado.</w:t>
+      </w:r>
+    </w:p>
+    <w:p>
+      <w:r>
+        <w:rPr>
+          <w:rFonts w:ascii="Times New Roman" w:hAnsi="Times New Roman" w:eastAsia="Times New Roman"/>
+          <w:b/>
+          <w:color w:val="000000"/>
+          <w:sz w:val="24"/>
+        </w:rPr>
+        <w:t>Por qué.</w:t>
+      </w:r>
+      <w:r>
+        <w:rPr>
+          <w:rFonts w:ascii="Times New Roman" w:hAnsi="Times New Roman" w:eastAsia="Times New Roman"/>
+          <w:b w:val="0"/>
+          <w:color w:val="000000"/>
+          <w:sz w:val="24"/>
+        </w:rPr>
+        <w:t xml:space="preserve"> Una skin nueva no toca código (Open/Closed llevado a datos). Y la Unidad 5 pide respetar la propiedad intelectual: por eso "Age of Empires" pasó a llamarse "Medieval" (era una marca) y se sacó la skin de Minecraft, que usaba personajes y texturas de Mojang sin una licencia que cubra este uso. </w:t>
+      </w:r>
+      <w:r>
+        <w:rPr>
+          <w:rFonts w:ascii="Courier New" w:hAnsi="Courier New" w:eastAsia="Courier New"/>
+          <w:b w:val="0"/>
+          <w:color w:val="000000"/>
+          <w:sz w:val="20"/>
+        </w:rPr>
+        <w:t>SkinTests</w:t>
+      </w:r>
+      <w:r>
+        <w:rPr>
+          <w:rFonts w:ascii="Times New Roman" w:hAnsi="Times New Roman" w:eastAsia="Times New Roman"/>
+          <w:b w:val="0"/>
+          <w:color w:val="000000"/>
+          <w:sz w:val="24"/>
+        </w:rPr>
+        <w:t xml:space="preserve"> revisa que ninguna skin del catálogo use esas marcas.</w:t>
+      </w:r>
+    </w:p>
+    <w:p>
+      <w:r>
+        <w:rPr>
+          <w:rFonts w:ascii="Times New Roman" w:hAnsi="Times New Roman" w:eastAsia="Times New Roman"/>
+          <w:b/>
+          <w:color w:val="000000"/>
+          <w:sz w:val="24"/>
+        </w:rPr>
+        <w:t>Cuándo se rompería.</w:t>
+      </w:r>
+      <w:r>
+        <w:rPr>
+          <w:rFonts w:ascii="Times New Roman" w:hAnsi="Times New Roman" w:eastAsia="Times New Roman"/>
+          <w:b w:val="0"/>
+          <w:color w:val="000000"/>
+          <w:sz w:val="24"/>
+        </w:rPr>
+        <w:t xml:space="preserve"> Si las skins necesitaran comportamiento propio (animaciones, sonidos), un archivo de datos no alcanzaría y cada una sería una clase.</w:t>
+      </w:r>
+    </w:p>
+    <w:p>
+      <w:pPr>
+        <w:pStyle w:val="Heading1"/>
+      </w:pPr>
+      <w:r>
+        <w:rPr>
+          <w:rFonts w:ascii="Times New Roman" w:hAnsi="Times New Roman" w:eastAsia="Times New Roman"/>
+          <w:b/>
+          <w:color w:val="000000"/>
+          <w:sz w:val="28"/>
+        </w:rPr>
+        <w:t>18. Tests del núcleo con un runner propio</w:t>
+      </w:r>
+    </w:p>
+    <w:p>
+      <w:r>
+        <w:rPr>
+          <w:rFonts w:ascii="Times New Roman" w:hAnsi="Times New Roman" w:eastAsia="Times New Roman"/>
+          <w:b/>
+          <w:color w:val="000000"/>
+          <w:sz w:val="24"/>
+        </w:rPr>
+        <w:t>Qué.</w:t>
+      </w:r>
+      <w:r>
+        <w:rPr>
+          <w:rFonts w:ascii="Times New Roman" w:hAnsi="Times New Roman" w:eastAsia="Times New Roman"/>
+          <w:b w:val="0"/>
+          <w:color w:val="000000"/>
+          <w:sz w:val="24"/>
+        </w:rPr>
+        <w:t xml:space="preserve"> Los tests están en </w:t>
+      </w:r>
+      <w:r>
+        <w:rPr>
+          <w:rFonts w:ascii="Courier New" w:hAnsi="Courier New" w:eastAsia="Courier New"/>
+          <w:b w:val="0"/>
+          <w:color w:val="000000"/>
+          <w:sz w:val="20"/>
+        </w:rPr>
+        <w:t>ChessCoreTests</w:t>
+      </w:r>
+      <w:r>
+        <w:rPr>
+          <w:rFonts w:ascii="Times New Roman" w:hAnsi="Times New Roman" w:eastAsia="Times New Roman"/>
+          <w:b w:val="0"/>
+          <w:color w:val="000000"/>
+          <w:sz w:val="24"/>
+        </w:rPr>
+        <w:t xml:space="preserve"> (y los de usuarios en </w:t>
+      </w:r>
+      <w:r>
+        <w:rPr>
+          <w:rFonts w:ascii="Courier New" w:hAnsi="Courier New" w:eastAsia="Courier New"/>
+          <w:b w:val="0"/>
+          <w:color w:val="000000"/>
+          <w:sz w:val="20"/>
+        </w:rPr>
+        <w:t>AccountTests</w:t>
+      </w:r>
+      <w:r>
+        <w:rPr>
+          <w:rFonts w:ascii="Times New Roman" w:hAnsi="Times New Roman" w:eastAsia="Times New Roman"/>
+          <w:b w:val="0"/>
+          <w:color w:val="000000"/>
+          <w:sz w:val="24"/>
+        </w:rPr>
+        <w:t>, con un almacén en memoria como fake), con formato Arrange-Act-Assert, un stub (</w:t>
+      </w:r>
+      <w:r>
+        <w:rPr>
+          <w:rFonts w:ascii="Courier New" w:hAnsi="Courier New" w:eastAsia="Courier New"/>
+          <w:b w:val="0"/>
+          <w:color w:val="000000"/>
+          <w:sz w:val="20"/>
+        </w:rPr>
+        <w:t>AlwaysQueenChooser</w:t>
+      </w:r>
+      <w:r>
+        <w:rPr>
+          <w:rFonts w:ascii="Times New Roman" w:hAnsi="Times New Roman" w:eastAsia="Times New Roman"/>
+          <w:b w:val="0"/>
+          <w:color w:val="000000"/>
+          <w:sz w:val="24"/>
+        </w:rPr>
+        <w:t>), un mock (</w:t>
+      </w:r>
+      <w:r>
+        <w:rPr>
+          <w:rFonts w:ascii="Courier New" w:hAnsi="Courier New" w:eastAsia="Courier New"/>
+          <w:b w:val="0"/>
+          <w:color w:val="000000"/>
+          <w:sz w:val="20"/>
+        </w:rPr>
+        <w:t>RecordingObserver</w:t>
+      </w:r>
+      <w:r>
+        <w:rPr>
+          <w:rFonts w:ascii="Times New Roman" w:hAnsi="Times New Roman" w:eastAsia="Times New Roman"/>
+          <w:b w:val="0"/>
+          <w:color w:val="000000"/>
+          <w:sz w:val="24"/>
+        </w:rPr>
+        <w:t xml:space="preserve">) y los marcados con </w:t>
+      </w:r>
+      <w:r>
+        <w:rPr>
+          <w:rFonts w:ascii="Courier New" w:hAnsi="Courier New" w:eastAsia="Courier New"/>
+          <w:b w:val="0"/>
+          <w:color w:val="000000"/>
+          <w:sz w:val="20"/>
+        </w:rPr>
+        <w:t>// TDD:</w:t>
+      </w:r>
+      <w:r>
+        <w:rPr>
+          <w:rFonts w:ascii="Times New Roman" w:hAnsi="Times New Roman" w:eastAsia="Times New Roman"/>
+          <w:b w:val="0"/>
+          <w:color w:val="000000"/>
+          <w:sz w:val="24"/>
+        </w:rPr>
+        <w:t xml:space="preserve"> escritos antes que el código. Se corren con </w:t>
+      </w:r>
+      <w:r>
+        <w:rPr>
+          <w:rFonts w:ascii="Courier New" w:hAnsi="Courier New" w:eastAsia="Courier New"/>
+          <w:b w:val="0"/>
+          <w:color w:val="000000"/>
+          <w:sz w:val="20"/>
+        </w:rPr>
+        <w:t>./scripts/test.sh</w:t>
+      </w:r>
+      <w:r>
+        <w:rPr>
+          <w:rFonts w:ascii="Times New Roman" w:hAnsi="Times New Roman" w:eastAsia="Times New Roman"/>
+          <w:b w:val="0"/>
+          <w:color w:val="000000"/>
+          <w:sz w:val="24"/>
+        </w:rPr>
+        <w:t xml:space="preserve"> y no usan librerías. Afuera del núcleo hay tests de integración de los adaptadores: </w:t>
+      </w:r>
+      <w:r>
+        <w:rPr>
+          <w:rFonts w:ascii="Courier New" w:hAnsi="Courier New" w:eastAsia="Courier New"/>
+          <w:b w:val="0"/>
+          <w:color w:val="000000"/>
+          <w:sz w:val="20"/>
+        </w:rPr>
+        <w:t>SkinTests</w:t>
+      </w:r>
+      <w:r>
+        <w:rPr>
+          <w:rFonts w:ascii="Times New Roman" w:hAnsi="Times New Roman" w:eastAsia="Times New Roman"/>
+          <w:b w:val="0"/>
+          <w:color w:val="000000"/>
+          <w:sz w:val="24"/>
+        </w:rPr>
+        <w:t xml:space="preserve"> y </w:t>
+      </w:r>
+      <w:r>
+        <w:rPr>
+          <w:rFonts w:ascii="Courier New" w:hAnsi="Courier New" w:eastAsia="Courier New"/>
+          <w:b w:val="0"/>
+          <w:color w:val="000000"/>
+          <w:sz w:val="20"/>
+        </w:rPr>
+        <w:t>scripts/SwingIntegrationTests.java</w:t>
+      </w:r>
+      <w:r>
+        <w:rPr>
+          <w:rFonts w:ascii="Times New Roman" w:hAnsi="Times New Roman" w:eastAsia="Times New Roman"/>
+          <w:b w:val="0"/>
+          <w:color w:val="000000"/>
+          <w:sz w:val="24"/>
+        </w:rPr>
+        <w:t>, que maneja la ventana real (pirámide de testing: muchos unitarios, menos de integración y uno de sistema).</w:t>
+      </w:r>
+    </w:p>
+    <w:p>
+      <w:r>
+        <w:rPr>
+          <w:rFonts w:ascii="Times New Roman" w:hAnsi="Times New Roman" w:eastAsia="Times New Roman"/>
+          <w:b/>
+          <w:color w:val="000000"/>
+          <w:sz w:val="24"/>
+        </w:rPr>
+        <w:t>Por qué.</w:t>
+      </w:r>
+      <w:r>
+        <w:rPr>
+          <w:rFonts w:ascii="Times New Roman" w:hAnsi="Times New Roman" w:eastAsia="Times New Roman"/>
+          <w:b w:val="0"/>
+          <w:color w:val="000000"/>
+          <w:sz w:val="24"/>
+        </w:rPr>
+        <w:t xml:space="preserve"> Corren solo con </w:t>
+      </w:r>
+      <w:r>
+        <w:rPr>
+          <w:rFonts w:ascii="Courier New" w:hAnsi="Courier New" w:eastAsia="Courier New"/>
+          <w:b w:val="0"/>
+          <w:color w:val="000000"/>
+          <w:sz w:val="20"/>
+        </w:rPr>
+        <w:t>javac</w:t>
+      </w:r>
+      <w:r>
+        <w:rPr>
+          <w:rFonts w:ascii="Times New Roman" w:hAnsi="Times New Roman" w:eastAsia="Times New Roman"/>
+          <w:b w:val="0"/>
+          <w:color w:val="000000"/>
+          <w:sz w:val="24"/>
+        </w:rPr>
+        <w:t>, sin infraestructura, que es lo que pide la consigna, y no hay nada para instalar ni explicar en la defensa.</w:t>
+      </w:r>
+    </w:p>
+    <w:p>
+      <w:r>
+        <w:rPr>
+          <w:rFonts w:ascii="Times New Roman" w:hAnsi="Times New Roman" w:eastAsia="Times New Roman"/>
+          <w:b/>
+          <w:color w:val="000000"/>
+          <w:sz w:val="24"/>
+        </w:rPr>
+        <w:t>Cuándo se rompería.</w:t>
+      </w:r>
+      <w:r>
+        <w:rPr>
+          <w:rFonts w:ascii="Times New Roman" w:hAnsi="Times New Roman" w:eastAsia="Times New Roman"/>
+          <w:b w:val="0"/>
+          <w:color w:val="000000"/>
+          <w:sz w:val="24"/>
+        </w:rPr>
+        <w:t xml:space="preserve"> En un proyecto real con un equipo grande convendría JUnit, por el reporte, los filtros y la integración con las herramientas.</w:t>
+      </w:r>
+    </w:p>
+    <w:p>
+      <w:pPr>
+        <w:pStyle w:val="Heading1"/>
+      </w:pPr>
+      <w:r>
+        <w:rPr>
+          <w:rFonts w:ascii="Times New Roman" w:hAnsi="Times New Roman" w:eastAsia="Times New Roman"/>
+          <w:b/>
+          <w:color w:val="000000"/>
+          <w:sz w:val="28"/>
+        </w:rPr>
+        <w:t>19. Simplificaciones declaradas</w:t>
       </w:r>
     </w:p>
     <w:p>

</xml_diff>

<commit_message>
Agrego la skin Cubos con las piezas de la version anterior
</commit_message>
<xml_diff>
--- a/docs/justificacion.docx
+++ b/docs/justificacion.docx
@@ -2725,7 +2725,7 @@
           <w:color w:val="000000"/>
           <w:sz w:val="28"/>
         </w:rPr>
-        <w:t>17. Las skins son datos, y sin derechos de terceros</w:t>
+        <w:t>17. Las skins se agregan con datos</w:t>
       </w:r>
     </w:p>
     <w:p>
@@ -2799,7 +2799,25 @@
           <w:color w:val="000000"/>
           <w:sz w:val="24"/>
         </w:rPr>
-        <w:t>. Solo se incluyen imágenes con licencia que lo permita y con autor citado.</w:t>
+        <w:t xml:space="preserve">. La procedencia de las imágenes se indica en </w:t>
+      </w:r>
+      <w:r>
+        <w:rPr>
+          <w:rFonts w:ascii="Courier New" w:hAnsi="Courier New" w:eastAsia="Courier New"/>
+          <w:b w:val="0"/>
+          <w:color w:val="000000"/>
+          <w:sz w:val="20"/>
+        </w:rPr>
+        <w:t>CREDITS.md</w:t>
+      </w:r>
+      <w:r>
+        <w:rPr>
+          <w:rFonts w:ascii="Times New Roman" w:hAnsi="Times New Roman" w:eastAsia="Times New Roman"/>
+          <w:b w:val="0"/>
+          <w:color w:val="000000"/>
+          <w:sz w:val="24"/>
+        </w:rPr>
+        <w:t>.</w:t>
       </w:r>
     </w:p>
     <w:p>
@@ -2819,7 +2837,7 @@
           <w:color w:val="000000"/>
           <w:sz w:val="24"/>
         </w:rPr>
-        <w:t xml:space="preserve"> Una skin nueva no toca código (Open/Closed llevado a datos). Y la Unidad 5 pide respetar la propiedad intelectual: por eso "Age of Empires" pasó a llamarse "Medieval" (era una marca) y se sacó la skin de Minecraft, que usaba personajes y texturas de Mojang sin una licencia que cubra este uso. </w:t>
+        <w:t xml:space="preserve"> Una skin nueva no toca código (Open/Closed llevado a datos). El catálogo incluye Clásico, Staunton, Medieval y Cubos. Cubos recupera las piezas de la antigua skin Minecraft, con su procedencia identificada en los créditos. </w:t>
       </w:r>
       <w:r>
         <w:rPr>
@@ -2837,7 +2855,7 @@
           <w:color w:val="000000"/>
           <w:sz w:val="24"/>
         </w:rPr>
-        <w:t xml:space="preserve"> revisa que ninguna skin del catálogo use esas marcas.</w:t>
+        <w:t xml:space="preserve"> comprueba que estén las doce imágenes de cada skin y que Cubos se desbloquee con 30 puntos.</w:t>
       </w:r>
     </w:p>
     <w:p>

</xml_diff>

<commit_message>
Corrijo la captura al paso, la repeticion y la copia de busqueda
La simulacion aplica las jugadas especiales completas. Las posiciones repetidas incluyen los derechos vigentes y la busqueda conserva el estado previo sin modificar la partida real. Agrego 17 regresiones y actualizo la documentacion.
</commit_message>
<xml_diff>
--- a/docs/justificacion.docx
+++ b/docs/justificacion.docx
@@ -3017,7 +3017,25 @@
           <w:color w:val="000000"/>
           <w:sz w:val="24"/>
         </w:rPr>
-        <w:t xml:space="preserve"> y no usan librerías. Afuera del núcleo hay tests de integración de los adaptadores: </w:t>
+        <w:t xml:space="preserve"> y no usan librerías. </w:t>
+      </w:r>
+      <w:r>
+        <w:rPr>
+          <w:rFonts w:ascii="Courier New" w:hAnsi="Courier New" w:eastAsia="Courier New"/>
+          <w:b w:val="0"/>
+          <w:color w:val="000000"/>
+          <w:sz w:val="20"/>
+        </w:rPr>
+        <w:t>RulesRegressionTests</w:t>
+      </w:r>
+      <w:r>
+        <w:rPr>
+          <w:rFonts w:ascii="Times New Roman" w:hAnsi="Times New Roman" w:eastAsia="Times New Roman"/>
+          <w:b w:val="0"/>
+          <w:color w:val="000000"/>
+          <w:sz w:val="24"/>
+        </w:rPr>
+        <w:t xml:space="preserve"> agrega 17 regresiones en memoria para captura al paso, repetición, copias de búsqueda y deshacer/rehacer. Afuera del núcleo hay tests de integración de los adaptadores: </w:t>
       </w:r>
       <w:r>
         <w:rPr>
@@ -3125,7 +3143,7 @@
           <w:color w:val="000000"/>
           <w:sz w:val="28"/>
         </w:rPr>
-        <w:t>19. Simplificaciones declaradas</w:t>
+        <w:t>19. Simulación y posiciones repetidas</w:t>
       </w:r>
     </w:p>
     <w:p>
@@ -3139,7 +3157,7 @@
           <w:color w:val="000000"/>
           <w:sz w:val="24"/>
         </w:rPr>
-        <w:t>La repetición de posición ignora los derechos de enroque y de captura al paso.</w:t>
+        <w:t>Las jugadas especiales se simulan con su comando sobre un tablero independiente. Capturar al paso retira al peón capturado antes de comprobar el jaque; consultar jugadas no pregunta por una coronación hipotética.</w:t>
       </w:r>
     </w:p>
     <w:p>
@@ -3148,12 +3166,39 @@
       </w:pPr>
       <w:r>
         <w:rPr>
+          <w:rFonts w:ascii="Courier New" w:hAnsi="Courier New" w:eastAsia="Courier New"/>
+          <w:b w:val="0"/>
+          <w:color w:val="000000"/>
+          <w:sz w:val="20"/>
+        </w:rPr>
+        <w:t>GamePosition</w:t>
+      </w:r>
+      <w:r>
+        <w:rPr>
           <w:rFonts w:ascii="Times New Roman" w:hAnsi="Times New Roman" w:eastAsia="Times New Roman"/>
           <w:b w:val="0"/>
           <w:color w:val="000000"/>
           <w:sz w:val="24"/>
         </w:rPr>
-        <w:t>La simulación de captura al paso no retira el peón capturado: puede permitir un jaque descubierto horizontal y también rechazar una captura que eliminaría al peón que da jaque.</w:t>
+        <w:t xml:space="preserve"> representa tablero, turno y derechos de las reglas especiales. Cada estrategia aporta esos derechos por </w:t>
+      </w:r>
+      <w:r>
+        <w:rPr>
+          <w:rFonts w:ascii="Courier New" w:hAnsi="Courier New" w:eastAsia="Courier New"/>
+          <w:b w:val="0"/>
+          <w:color w:val="000000"/>
+          <w:sz w:val="20"/>
+        </w:rPr>
+        <w:t>positionState</w:t>
+      </w:r>
+      <w:r>
+        <w:rPr>
+          <w:rFonts w:ascii="Times New Roman" w:hAnsi="Times New Roman" w:eastAsia="Times New Roman"/>
+          <w:b w:val="0"/>
+          <w:color w:val="000000"/>
+          <w:sz w:val="24"/>
+        </w:rPr>
+        <w:t>: el enroque cuenta aunque esté bloqueado temporalmente, y la captura al paso solo cuando es legal. Una oportunidad imposible por jaque no distingue posiciones.</w:t>
       </w:r>
     </w:p>
     <w:p>
@@ -3162,12 +3207,35 @@
       </w:pPr>
       <w:r>
         <w:rPr>
+          <w:rFonts w:ascii="Courier New" w:hAnsi="Courier New" w:eastAsia="Courier New"/>
+          <w:b w:val="0"/>
+          <w:color w:val="000000"/>
+          <w:sz w:val="20"/>
+        </w:rPr>
+        <w:t>IChessGame.copy</w:t>
+      </w:r>
+      <w:r>
+        <w:rPr>
           <w:rFonts w:ascii="Times New Roman" w:hAnsi="Times New Roman" w:eastAsia="Times New Roman"/>
           <w:b w:val="0"/>
           <w:color w:val="000000"/>
           <w:sz w:val="24"/>
         </w:rPr>
-        <w:t>La búsqueda de la IA no conserva el historial: puede evaluar de forma imprecisa el enroque, la captura al paso y las tablas por repetición o por 50 movimientos. La jugada final se filtra contra las jugadas legales de la partida real.</w:t>
+        <w:t xml:space="preserve"> conserva casillas tocadas, última jugada, reloj de medias jugadas, posiciones anteriores y estado terminal. La copia recibe las mismas reglas especiales con una coronación automática y mantiene las reglas de tablas configuradas. No comparte comandos ni listeners con la partida real; solo deshace sus propias jugadas.</w:t>
+      </w:r>
+    </w:p>
+    <w:p>
+      <w:pPr>
+        <w:pStyle w:val="ListBullet"/>
+      </w:pPr>
+      <w:r>
+        <w:rPr>
+          <w:rFonts w:ascii="Times New Roman" w:hAnsi="Times New Roman" w:eastAsia="Times New Roman"/>
+          <w:b w:val="0"/>
+          <w:color w:val="000000"/>
+          <w:sz w:val="24"/>
+        </w:rPr>
+        <w:t>La búsqueda sigue limitada a la profundidad configurada. La jugada final también se contrasta con las legales de la partida real.</w:t>
       </w:r>
     </w:p>
     <w:p>

</xml_diff>